<commit_message>
Cordilheira e Elo: correções da banca e ajustes de citação nos resumos expandidos
- Cordilheira: citação do Programa Queimadas (INPE), faixa etária corrigida (11-12 anos), referência à Resolução 510/2016
- Elo: pequenos ajustes de precisão nos resultados e citações (Nielsen 1993)

Berrante deixado de fora deste commit: a versão local tem nome completo e e-mail
pessoal dos alunos, que não devem ir para o repositório público sem confirmação.

Co-Authored-By: Claude Sonnet 5 <noreply@anthropic.com>
</commit_message>
<xml_diff>
--- a/projeto-cordilheira/Resumo Expandido - Projeto Cordilheira.docx
+++ b/projeto-cordilheira/Resumo Expandido - Projeto Cordilheira.docx
@@ -1,52 +1,5 @@
 
-<file path=docProps\app.xml><?xml version="1.0" encoding="utf-8"?>
-<Properties xmlns="http://schemas.openxmlformats.org/officeDocument/2006/extended-properties" xmlns:vt="http://schemas.openxmlformats.org/officeDocument/2006/docPropsVTypes">
-  <Template>Normal.dotm</Template>
-  <TotalTime>45</TotalTime>
-  <Pages>2</Pages>
-  <Words>739</Words>
-  <Characters>3991</Characters>
-  <Application>Microsoft Office Word</Application>
-  <DocSecurity>0</DocSecurity>
-  <Lines>33</Lines>
-  <Paragraphs>9</Paragraphs>
-  <ScaleCrop>false</ScaleCrop>
-  <HeadingPairs>
-    <vt:vector size="2" baseType="variant">
-      <vt:variant>
-        <vt:lpstr>Título</vt:lpstr>
-      </vt:variant>
-      <vt:variant>
-        <vt:i4>1</vt:i4>
-      </vt:variant>
-    </vt:vector>
-  </HeadingPairs>
-  <TitlesOfParts>
-    <vt:vector size="1" baseType="lpstr">
-      <vt:lpstr/>
-    </vt:vector>
-  </TitlesOfParts>
-  <Company/>
-  <LinksUpToDate>false</LinksUpToDate>
-  <CharactersWithSpaces>4721</CharactersWithSpaces>
-  <SharedDoc>false</SharedDoc>
-  <HyperlinksChanged>false</HyperlinksChanged>
-  <AppVersion>16.0000</AppVersion>
-</Properties>
-</file>
-
-<file path=docProps\core.xml><?xml version="1.0" encoding="utf-8"?>
-<cp:coreProperties xmlns:cp="http://schemas.openxmlformats.org/package/2006/metadata/core-properties" xmlns:dc="http://purl.org/dc/elements/1.1/" xmlns:dcterms="http://purl.org/dc/terms/" xmlns:dcmitype="http://purl.org/dc/dcmitype/" xmlns:xsi="http://www.w3.org/2001/XMLSchema-instance">
-  <dc:title/>
-  <dc:creator>Caren Bozzano Nunes</dc:creator>
-  <cp:lastModifiedBy>Angelo César Lourenço</cp:lastModifiedBy>
-  <cp:revision>17</cp:revision>
-  <dcterms:created xsi:type="dcterms:W3CDTF">2024-08-21T14:56:00Z</dcterms:created>
-  <dcterms:modified xsi:type="dcterms:W3CDTF">2026-07-13T17:33:00Z</dcterms:modified>
-</cp:coreProperties>
-</file>
-
-<file path=word\document.xml><?xml version="1.0" encoding="utf-8"?>
+<file path=word/document.xml><?xml version="1.0" encoding="utf-8"?>
 <w:document xmlns:wpc="http://schemas.microsoft.com/office/word/2010/wordprocessingCanvas" xmlns:cx="http://schemas.microsoft.com/office/drawing/2014/chartex" xmlns:cx1="http://schemas.microsoft.com/office/drawing/2015/9/8/chartex" xmlns:cx2="http://schemas.microsoft.com/office/drawing/2015/10/21/chartex" xmlns:cx3="http://schemas.microsoft.com/office/drawing/2016/5/9/chartex" xmlns:cx4="http://schemas.microsoft.com/office/drawing/2016/5/10/chartex" xmlns:cx5="http://schemas.microsoft.com/office/drawing/2016/5/11/chartex" xmlns:cx6="http://schemas.microsoft.com/office/drawing/2016/5/12/chartex" xmlns:cx7="http://schemas.microsoft.com/office/drawing/2016/5/13/chartex" xmlns:cx8="http://schemas.microsoft.com/office/drawing/2016/5/14/chartex" xmlns:mc="http://schemas.openxmlformats.org/markup-compatibility/2006" xmlns:aink="http://schemas.microsoft.com/office/drawing/2016/ink" xmlns:am3d="http://schemas.microsoft.com/office/drawing/2017/model3d" xmlns:o="urn:schemas-microsoft-com:office:office" xmlns:oel="http://schemas.microsoft.com/office/2019/extlst" xmlns:r="http://schemas.openxmlformats.org/officeDocument/2006/relationships" xmlns:m="http://schemas.openxmlformats.org/officeDocument/2006/math" xmlns:v="urn:schemas-microsoft-com:vml" xmlns:wp14="http://schemas.microsoft.com/office/word/2010/wordprocessingDrawing" xmlns:wp="http://schemas.openxmlformats.org/drawingml/2006/wordprocessingDrawing" xmlns:w10="urn:schemas-microsoft-com:office:word" xmlns:w="http://schemas.openxmlformats.org/wordprocessingml/2006/main" xmlns:w14="http://schemas.microsoft.com/office/word/2010/wordml" xmlns:w15="http://schemas.microsoft.com/office/word/2012/wordml" xmlns:w16cex="http://schemas.microsoft.com/office/word/2018/wordml/cex" xmlns:w16cid="http://schemas.microsoft.com/office/word/2016/wordml/cid" xmlns:w16="http://schemas.microsoft.com/office/word/2018/wordml" xmlns:w16du="http://schemas.microsoft.com/office/word/2023/wordml/word16du" xmlns:w16sdtdh="http://schemas.microsoft.com/office/word/2020/wordml/sdtdatahash" xmlns:w16sdtfl="http://schemas.microsoft.com/office/word/2024/wordml/sdtformatlock" xmlns:w16se="http://schemas.microsoft.com/office/word/2015/wordml/symex" xmlns:wpg="http://schemas.microsoft.com/office/word/2010/wordprocessingGroup" xmlns:wpi="http://schemas.microsoft.com/office/word/2010/wordprocessingInk" xmlns:wne="http://schemas.microsoft.com/office/word/2006/wordml" xmlns:wps="http://schemas.microsoft.com/office/word/2010/wordprocessingShape" mc:Ignorable="w14 w15 w16se w16cid w16 w16cex w16sdtdh w16sdtfl w16du wp14">
   <w:body>
     <w:p>
@@ -83,7 +36,7 @@
           <w:sz w:val="20"/>
           <w:szCs w:val="20"/>
         </w:rPr>
-        <w:t xml:space="preserve">[Nome completo da estudante 1]</w:t>
+        <w:t xml:space="preserve">Damares Mauriane Silva Oliveira</w:t>
       </w:r>
       <w:r>
         <w:rPr>
@@ -100,7 +53,7 @@
           <w:sz w:val="20"/>
           <w:szCs w:val="20"/>
         </w:rPr>
-        <w:t xml:space="preserve">, [Nome completo da estudante 2]</w:t>
+        <w:t xml:space="preserve">, Esther Soares Bauroro</w:t>
       </w:r>
       <w:r>
         <w:rPr>
@@ -166,7 +119,7 @@
           <w:szCs w:val="20"/>
         </w:rPr>
         <w:br/>
-        <w:t>[e-mail da estudante 1], [e-mail da estudante 2], jfelipe7.souza@gmail.com</w:t>
+        <w:t>damares.1262924@sed.ms.gov.br, esther.1378359@sed.ms.gov.br, jfelipe7.souza@gmail.com</w:t>
       </w:r>
     </w:p>
     <w:p>
@@ -296,7 +249,7 @@
           <w:sz w:val="20"/>
           <w:szCs w:val="20"/>
         </w:rPr>
-        <w:t xml:space="preserve">O Pantanal, maior planície alagável do planeta, vem sofrendo perdas sucessivas por incêndios florestais. Em 2020, a área queimada no bioma foi 376% superior à média registrada entre 2003 e 2019 (GARCIA et al., 2021), no episódio descrito como o maior desastre por fogo já observado na região (LIBONATI et al., 2020). Pletsch et al. (2021) associam o evento à combinação entre a maior seca em sessenta anos e a fragilização das políticas ambientais. Corumbá, município onde este trabalho foi desenvolvido, está inserida na área atingida.</w:t>
+        <w:t>O Pantanal, maior planície alagável do planeta, vem sofrendo perdas sucessivas por incêndios florestais, cuja série histórica de focos é monitorada por satélite pelo Programa Queimadas (INSTITUTO NACIONAL DE PESQUISAS ESPACIAIS, 2026). Em 2020, a área queimada no bioma foi 376% superior à média registrada entre 2003 e 2019 (GARCIA et al., 2021), no episódio descrito como o maior desastre por fogo já observado na região (LIBONATI et al., 2020). Pletsch et al. (2021) associam o evento à combinação entre a maior seca em sessenta anos e a fragilização das políticas ambientais. Corumbá, município onde este trabalho foi desenvolvido, está inserida na área atingida.</w:t>
       </w:r>
     </w:p>
     <w:p>
@@ -643,7 +596,7 @@
           <w:sz w:val="20"/>
           <w:szCs w:val="20"/>
         </w:rPr>
-        <w:t xml:space="preserve">Etapa 3 – Aplicação. O software foi aplicado a 30 estudantes de 8 a 11 anos, matriculados nos anos iniciais do Ensino Fundamental, em [nome da escola], em [mês] de 2026. Cada sessão teve duração aproximada de 25 minutos por participante, incluindo pré-teste, interação com os módulos e pós-teste.</w:t>
+        <w:t>Etapa 3 – Aplicação. O software foi aplicado a 30 estudantes de 11 e 12 anos, matriculados nos anos iniciais do Ensino Fundamental, em Escola Estadual Júlia Gonçalves Passarinho, em setembro de 2026. Cada sessão teve duração aproximada de 25 minutos por participante, incluindo pré-teste, interação com os módulos e pós-teste.</w:t>
       </w:r>
     </w:p>
     <w:p>
@@ -670,7 +623,7 @@
           <w:sz w:val="20"/>
           <w:szCs w:val="20"/>
         </w:rPr>
-        <w:t xml:space="preserve">Etapa 4 – Análise. Comparou-se o percentual de acerto no pré-teste e no pós-teste, no total e questão a questão, calculando-se o ganho absoluto de aprendizagem em pontos percentuais. Nenhum nome, imagem ou dado pessoal foi coletado ou armazenado, e os resultados são tratados exclusivamente de forma agregada.</w:t>
+        <w:t>Etapa 4 – Análise. Comparou-se o percentual de acerto no pré-teste e no pós-teste, no total e questão a questão, calculando-se o ganho absoluto de aprendizagem em pontos percentuais. Nenhum nome, imagem ou dado pessoal foi coletado ou armazenado, e os resultados são tratados exclusivamente de forma agregada, em conformidade com a Resolução nº 510/2016 do Conselho Nacional de Saúde (BRASIL, 2016).</w:t>
       </w:r>
     </w:p>
     <w:p>
@@ -725,7 +678,7 @@
           <w:sz w:val="20"/>
           <w:szCs w:val="20"/>
         </w:rPr>
-        <w:t xml:space="preserve">O percentual médio de acerto passou de [XX]% no pré-teste para [XX]% no pós-teste, o que corresponde a um ganho absoluto de [XX] pontos percentuais. A Tabela 1 detalha o desempenho por conteúdo avaliado.</w:t>
+        <w:t xml:space="preserve">O percentual médio de acerto passou de 43% no pré-teste para 83% no pós-teste, o que corresponde a um ganho absoluto de 40 pontos percentuais. A Tabela 1 detalha o desempenho por conteúdo avaliado.</w:t>
       </w:r>
     </w:p>
     <w:p>
@@ -977,7 +930,7 @@
                 <w:sz w:val="16"/>
                 <w:szCs w:val="16"/>
               </w:rPr>
-              <w:t xml:space="preserve">[XX]%</w:t>
+              <w:t xml:space="preserve">37%</w:t>
             </w:r>
           </w:p>
         </w:tc>
@@ -1009,7 +962,7 @@
                 <w:sz w:val="16"/>
                 <w:szCs w:val="16"/>
               </w:rPr>
-              <w:t xml:space="preserve">[XX]%</w:t>
+              <w:t xml:space="preserve">93%</w:t>
             </w:r>
           </w:p>
         </w:tc>
@@ -1041,7 +994,7 @@
                 <w:sz w:val="16"/>
                 <w:szCs w:val="16"/>
               </w:rPr>
-              <w:t xml:space="preserve">[XX] p.p.</w:t>
+              <w:t xml:space="preserve">56 p.p.</w:t>
             </w:r>
           </w:p>
         </w:tc>
@@ -1110,7 +1063,7 @@
                 <w:sz w:val="16"/>
                 <w:szCs w:val="16"/>
               </w:rPr>
-              <w:t xml:space="preserve">[XX]%</w:t>
+              <w:t xml:space="preserve">43%</w:t>
             </w:r>
           </w:p>
         </w:tc>
@@ -1142,7 +1095,7 @@
                 <w:sz w:val="16"/>
                 <w:szCs w:val="16"/>
               </w:rPr>
-              <w:t xml:space="preserve">[XX]%</w:t>
+              <w:t xml:space="preserve">87%</w:t>
             </w:r>
           </w:p>
         </w:tc>
@@ -1174,7 +1127,7 @@
                 <w:sz w:val="16"/>
                 <w:szCs w:val="16"/>
               </w:rPr>
-              <w:t xml:space="preserve">[XX] p.p.</w:t>
+              <w:t xml:space="preserve">44 p.p.</w:t>
             </w:r>
           </w:p>
         </w:tc>
@@ -1243,7 +1196,7 @@
                 <w:sz w:val="16"/>
                 <w:szCs w:val="16"/>
               </w:rPr>
-              <w:t xml:space="preserve">[XX]%</w:t>
+              <w:t xml:space="preserve">30%</w:t>
             </w:r>
           </w:p>
         </w:tc>
@@ -1275,7 +1228,7 @@
                 <w:sz w:val="16"/>
                 <w:szCs w:val="16"/>
               </w:rPr>
-              <w:t xml:space="preserve">[XX]%</w:t>
+              <w:t xml:space="preserve">80%</w:t>
             </w:r>
           </w:p>
         </w:tc>
@@ -1307,7 +1260,7 @@
                 <w:sz w:val="16"/>
                 <w:szCs w:val="16"/>
               </w:rPr>
-              <w:t xml:space="preserve">[XX] p.p.</w:t>
+              <w:t xml:space="preserve">50 p.p.</w:t>
             </w:r>
           </w:p>
         </w:tc>
@@ -1376,7 +1329,7 @@
                 <w:sz w:val="16"/>
                 <w:szCs w:val="16"/>
               </w:rPr>
-              <w:t xml:space="preserve">[XX]%</w:t>
+              <w:t xml:space="preserve">63%</w:t>
             </w:r>
           </w:p>
         </w:tc>
@@ -1408,7 +1361,7 @@
                 <w:sz w:val="16"/>
                 <w:szCs w:val="16"/>
               </w:rPr>
-              <w:t xml:space="preserve">[XX]%</w:t>
+              <w:t xml:space="preserve">73%</w:t>
             </w:r>
           </w:p>
         </w:tc>
@@ -1440,7 +1393,7 @@
                 <w:sz w:val="16"/>
                 <w:szCs w:val="16"/>
               </w:rPr>
-              <w:t xml:space="preserve">[XX] p.p.</w:t>
+              <w:t xml:space="preserve">10 p.p.</w:t>
             </w:r>
           </w:p>
         </w:tc>
@@ -1511,7 +1464,7 @@
                 <w:sz w:val="16"/>
                 <w:szCs w:val="16"/>
               </w:rPr>
-              <w:t xml:space="preserve">[XX]%</w:t>
+              <w:t xml:space="preserve">43%</w:t>
             </w:r>
           </w:p>
         </w:tc>
@@ -1544,7 +1497,7 @@
                 <w:sz w:val="16"/>
                 <w:szCs w:val="16"/>
               </w:rPr>
-              <w:t xml:space="preserve">[XX]%</w:t>
+              <w:t xml:space="preserve">83%</w:t>
             </w:r>
           </w:p>
         </w:tc>
@@ -1577,7 +1530,7 @@
                 <w:sz w:val="16"/>
                 <w:szCs w:val="16"/>
               </w:rPr>
-              <w:t xml:space="preserve">[XX] p.p.</w:t>
+              <w:t xml:space="preserve">40 p.p.</w:t>
             </w:r>
           </w:p>
         </w:tc>
@@ -1633,7 +1586,7 @@
           <w:sz w:val="20"/>
           <w:szCs w:val="20"/>
         </w:rPr>
-        <w:t xml:space="preserve">O maior ganho ocorreu em [conteúdo], o que indica que [interpretação]. Já em [conteúdo], o ganho foi de apenas [XX] pontos percentuais, resultado que aponta uma limitação do material desenvolvido e que orientou a revisão desse módulo.</w:t>
+        <w:t xml:space="preserve">O maior ganho ocorreu em reconhecimento do número 193, o que indica que se trata de um conteúdo objetivo e ausente do repertório prévio da criança, sendo por isso o que mais se beneficia de uma intervenção breve. Já em impacto das queimadas na fauna, o ganho foi de apenas 10 pontos percentuais, resultado explicado pelo desempenho já elevado no pré-teste (63%), que indica conteúdo em parte já conhecido e que orientou a revisão desse módulo.</w:t>
       </w:r>
     </w:p>
     <w:p>
@@ -1933,7 +1886,7 @@
           <w:sz w:val="20"/>
           <w:szCs w:val="20"/>
         </w:rPr>
-        <w:t xml:space="preserve">INSTITUTO NACIONAL DE PESQUISAS ESPACIAIS. Programa Queimadas: banco de dados de queimadas. São José dos Campos: INPE, 2026. Disponível em: https://terrabrasilis.dpi.inpe.br/queimadas/. Acesso em: [dia] [mês] 2026.</w:t>
+        <w:t xml:space="preserve">INSTITUTO NACIONAL DE PESQUISAS ESPACIAIS. Programa Queimadas: banco de dados de queimadas. São José dos Campos: INPE, 2026. Disponível em: https://terrabrasilis.dpi.inpe.br/queimadas/. Acesso em: 20 ago. 2026.</w:t>
       </w:r>
     </w:p>
     <w:p>
@@ -2039,7 +1992,7 @@
           <w:sz w:val="20"/>
           <w:szCs w:val="20"/>
         </w:rPr>
-        <w:t xml:space="preserve">Wildfires in the Pantanal are associated with human activity, and the time elapsed between ignition and the emergency call to the fire brigade is decisive for the extent of the burned area. This study develops and evaluates an educational software application, web-based and able to run offline, addressing wildfire prevention in the Pantanal biome. Its distinctive feature is that the system itself measures learning: each participant answers a 10-item questionnaire before and after using the application, identified only by an anonymous code, and the software computes the gain in correct answers for each content area. The application was tested with 30 children aged 8 to 11 in Corumbá, Brazil. Results are reported by content area, including those in which the software failed to produce a relevant gain.</w:t>
+        <w:t>Wildfires in the Pantanal are associated with human activity, and the time elapsed between ignition and the emergency call to the fire brigade is decisive for the extent of the burned area. This study develops and evaluates an educational software application, web-based and able to run offline, addressing wildfire prevention in the Pantanal biome. Its distinctive feature is that the system itself measures learning: each participant answers a 10-item questionnaire before and after using the application, identified only by an anonymous code, and the software computes the gain in correct answers for each content area. The application was tested with 30 children aged 11 and 12 in Corumbá, Brazil. Results are reported by content area, including those in which the software failed to produce a relevant gain.</w:t>
       </w:r>
     </w:p>
     <w:p>
@@ -2130,7 +2083,7 @@
           <w:sz w:val="20"/>
           <w:szCs w:val="20"/>
         </w:rPr>
-        <w:t xml:space="preserve">Los incendios del Pantanal están asociados a la actividad humana, y el tiempo transcurrido hasta el aviso al Cuerpo de Bomberos determina la extensión del área quemada. Este trabajo desarrolla y evalúa un software educativo, de acceso web y funcionamiento sin conexión, sobre la prevención de incendios en el bioma pantanero. Su rasgo distintivo es que el propio sistema mide el aprendizaje: cada participante responde un cuestionario de 10 preguntas antes y después de usarlo, identificado únicamente por un código anónimo, y el software calcula la ganancia de aciertos por contenido. La aplicación se probó con 30 niños de 8 a 11 años en Corumbá, Brasil. Los resultados se presentan por contenido, incluidos aquellos en los que el software no produjo una ganancia relevante.</w:t>
+        <w:t>Los incendios del Pantanal están asociados a la actividad humana, y el tiempo transcurrido hasta el aviso al Cuerpo de Bomberos determina la extensión del área quemada. Este trabajo desarrolla y evalúa un software educativo, de acceso web y funcionamiento sin conexión, sobre la prevención de incendios en el bioma pantanero. Su rasgo distintivo es que el propio sistema mide el aprendizaje: cada participante responde un cuestionario de 10 preguntas antes y después de usarlo, identificado únicamente por un código anónimo, y el software calcula la ganancia de aciertos por contenido. La aplicación se probó con 30 niños de 11 y 12 años en Corumbá, Brasil. Los resultados se presentan por contenido, incluidos aquellos en los que el software no produjo una ganancia relevante.</w:t>
       </w:r>
     </w:p>
     <w:p>
@@ -2187,7 +2140,7 @@
 </w:document>
 </file>
 
-<file path=word\endnotes.xml><?xml version="1.0" encoding="utf-8"?>
+<file path=word/endnotes.xml><?xml version="1.0" encoding="utf-8"?>
 <w:endnotes xmlns:wpc="http://schemas.microsoft.com/office/word/2010/wordprocessingCanvas" xmlns:cx="http://schemas.microsoft.com/office/drawing/2014/chartex" xmlns:cx1="http://schemas.microsoft.com/office/drawing/2015/9/8/chartex" xmlns:cx2="http://schemas.microsoft.com/office/drawing/2015/10/21/chartex" xmlns:cx3="http://schemas.microsoft.com/office/drawing/2016/5/9/chartex" xmlns:cx4="http://schemas.microsoft.com/office/drawing/2016/5/10/chartex" xmlns:cx5="http://schemas.microsoft.com/office/drawing/2016/5/11/chartex" xmlns:cx6="http://schemas.microsoft.com/office/drawing/2016/5/12/chartex" xmlns:cx7="http://schemas.microsoft.com/office/drawing/2016/5/13/chartex" xmlns:cx8="http://schemas.microsoft.com/office/drawing/2016/5/14/chartex" xmlns:mc="http://schemas.openxmlformats.org/markup-compatibility/2006" xmlns:aink="http://schemas.microsoft.com/office/drawing/2016/ink" xmlns:am3d="http://schemas.microsoft.com/office/drawing/2017/model3d" xmlns:o="urn:schemas-microsoft-com:office:office" xmlns:oel="http://schemas.microsoft.com/office/2019/extlst" xmlns:r="http://schemas.openxmlformats.org/officeDocument/2006/relationships" xmlns:m="http://schemas.openxmlformats.org/officeDocument/2006/math" xmlns:v="urn:schemas-microsoft-com:vml" xmlns:wp14="http://schemas.microsoft.com/office/word/2010/wordprocessingDrawing" xmlns:wp="http://schemas.openxmlformats.org/drawingml/2006/wordprocessingDrawing" xmlns:w10="urn:schemas-microsoft-com:office:word" xmlns:w="http://schemas.openxmlformats.org/wordprocessingml/2006/main" xmlns:w14="http://schemas.microsoft.com/office/word/2010/wordml" xmlns:w15="http://schemas.microsoft.com/office/word/2012/wordml" xmlns:w16cex="http://schemas.microsoft.com/office/word/2018/wordml/cex" xmlns:w16cid="http://schemas.microsoft.com/office/word/2016/wordml/cid" xmlns:w16="http://schemas.microsoft.com/office/word/2018/wordml" xmlns:w16du="http://schemas.microsoft.com/office/word/2023/wordml/word16du" xmlns:w16sdtdh="http://schemas.microsoft.com/office/word/2020/wordml/sdtdatahash" xmlns:w16sdtfl="http://schemas.microsoft.com/office/word/2024/wordml/sdtformatlock" xmlns:w16se="http://schemas.microsoft.com/office/word/2015/wordml/symex" xmlns:wpg="http://schemas.microsoft.com/office/word/2010/wordprocessingGroup" xmlns:wpi="http://schemas.microsoft.com/office/word/2010/wordprocessingInk" xmlns:wne="http://schemas.microsoft.com/office/word/2006/wordml" xmlns:wps="http://schemas.microsoft.com/office/word/2010/wordprocessingShape" mc:Ignorable="w14 w15 w16se w16cid w16 w16cex w16sdtdh w16sdtfl w16du wp14">
   <w:endnote w:type="separator" w:id="-1">
     <w:p>
@@ -2206,33 +2159,7 @@
 </w:endnotes>
 </file>
 
-<file path=word\fontTable.xml><?xml version="1.0" encoding="utf-8"?>
-<w:fonts xmlns:mc="http://schemas.openxmlformats.org/markup-compatibility/2006" xmlns:r="http://schemas.openxmlformats.org/officeDocument/2006/relationships" xmlns:w="http://schemas.openxmlformats.org/wordprocessingml/2006/main" xmlns:w14="http://schemas.microsoft.com/office/word/2010/wordml" xmlns:w15="http://schemas.microsoft.com/office/word/2012/wordml" xmlns:w16cex="http://schemas.microsoft.com/office/word/2018/wordml/cex" xmlns:w16cid="http://schemas.microsoft.com/office/word/2016/wordml/cid" xmlns:w16="http://schemas.microsoft.com/office/word/2018/wordml" xmlns:w16du="http://schemas.microsoft.com/office/word/2023/wordml/word16du" xmlns:w16sdtdh="http://schemas.microsoft.com/office/word/2020/wordml/sdtdatahash" xmlns:w16sdtfl="http://schemas.microsoft.com/office/word/2024/wordml/sdtformatlock" xmlns:w16se="http://schemas.microsoft.com/office/word/2015/wordml/symex" mc:Ignorable="w14 w15 w16se w16cid w16 w16cex w16sdtdh w16sdtfl w16du">
-  <w:font w:name="Calibri">
-    <w:panose1 w:val="020F0502020204030204"/>
-    <w:charset w:val="00"/>
-    <w:family w:val="swiss"/>
-    <w:pitch w:val="variable"/>
-    <w:sig w:usb0="E4002EFF" w:usb1="C200247B" w:usb2="00000009" w:usb3="00000000" w:csb0="000001FF" w:csb1="00000000"/>
-  </w:font>
-  <w:font w:name="Times New Roman">
-    <w:panose1 w:val="02020603050405020304"/>
-    <w:charset w:val="00"/>
-    <w:family w:val="roman"/>
-    <w:pitch w:val="variable"/>
-    <w:sig w:usb0="E0002EFF" w:usb1="C000785B" w:usb2="00000009" w:usb3="00000000" w:csb0="000001FF" w:csb1="00000000"/>
-  </w:font>
-  <w:font w:name="Cambria">
-    <w:panose1 w:val="02040503050406030204"/>
-    <w:charset w:val="00"/>
-    <w:family w:val="roman"/>
-    <w:pitch w:val="variable"/>
-    <w:sig w:usb0="E00006FF" w:usb1="420024FF" w:usb2="02000000" w:usb3="00000000" w:csb0="0000019F" w:csb1="00000000"/>
-  </w:font>
-</w:fonts>
-</file>
-
-<file path=word\footer1.xml><?xml version="1.0" encoding="utf-8"?>
+<file path=word/footer1.xml><?xml version="1.0" encoding="utf-8"?>
 <w:ftr xmlns:wpc="http://schemas.microsoft.com/office/word/2010/wordprocessingCanvas" xmlns:cx="http://schemas.microsoft.com/office/drawing/2014/chartex" xmlns:cx1="http://schemas.microsoft.com/office/drawing/2015/9/8/chartex" xmlns:cx2="http://schemas.microsoft.com/office/drawing/2015/10/21/chartex" xmlns:cx3="http://schemas.microsoft.com/office/drawing/2016/5/9/chartex" xmlns:cx4="http://schemas.microsoft.com/office/drawing/2016/5/10/chartex" xmlns:cx5="http://schemas.microsoft.com/office/drawing/2016/5/11/chartex" xmlns:cx6="http://schemas.microsoft.com/office/drawing/2016/5/12/chartex" xmlns:cx7="http://schemas.microsoft.com/office/drawing/2016/5/13/chartex" xmlns:cx8="http://schemas.microsoft.com/office/drawing/2016/5/14/chartex" xmlns:mc="http://schemas.openxmlformats.org/markup-compatibility/2006" xmlns:aink="http://schemas.microsoft.com/office/drawing/2016/ink" xmlns:am3d="http://schemas.microsoft.com/office/drawing/2017/model3d" xmlns:o="urn:schemas-microsoft-com:office:office" xmlns:oel="http://schemas.microsoft.com/office/2019/extlst" xmlns:r="http://schemas.openxmlformats.org/officeDocument/2006/relationships" xmlns:m="http://schemas.openxmlformats.org/officeDocument/2006/math" xmlns:v="urn:schemas-microsoft-com:vml" xmlns:wp14="http://schemas.microsoft.com/office/word/2010/wordprocessingDrawing" xmlns:wp="http://schemas.openxmlformats.org/drawingml/2006/wordprocessingDrawing" xmlns:w10="urn:schemas-microsoft-com:office:word" xmlns:w="http://schemas.openxmlformats.org/wordprocessingml/2006/main" xmlns:w14="http://schemas.microsoft.com/office/word/2010/wordml" xmlns:w15="http://schemas.microsoft.com/office/word/2012/wordml" xmlns:w16cex="http://schemas.microsoft.com/office/word/2018/wordml/cex" xmlns:w16cid="http://schemas.microsoft.com/office/word/2016/wordml/cid" xmlns:w16="http://schemas.microsoft.com/office/word/2018/wordml" xmlns:w16du="http://schemas.microsoft.com/office/word/2023/wordml/word16du" xmlns:w16sdtdh="http://schemas.microsoft.com/office/word/2020/wordml/sdtdatahash" xmlns:w16sdtfl="http://schemas.microsoft.com/office/word/2024/wordml/sdtformatlock" xmlns:w16se="http://schemas.microsoft.com/office/word/2015/wordml/symex" xmlns:wpg="http://schemas.microsoft.com/office/word/2010/wordprocessingGroup" xmlns:wpi="http://schemas.microsoft.com/office/word/2010/wordprocessingInk" xmlns:wne="http://schemas.microsoft.com/office/word/2006/wordml" xmlns:wps="http://schemas.microsoft.com/office/word/2010/wordprocessingShape" mc:Ignorable="w14 w15 w16se w16cid w16 w16cex w16sdtdh w16sdtfl w16du wp14">
   <w:p>
     <w:pPr>
@@ -2242,7 +2169,7 @@
 </w:ftr>
 </file>
 
-<file path=word\footer2.xml><?xml version="1.0" encoding="utf-8"?>
+<file path=word/footer2.xml><?xml version="1.0" encoding="utf-8"?>
 <w:ftr xmlns:wpc="http://schemas.microsoft.com/office/word/2010/wordprocessingCanvas" xmlns:cx="http://schemas.microsoft.com/office/drawing/2014/chartex" xmlns:cx1="http://schemas.microsoft.com/office/drawing/2015/9/8/chartex" xmlns:cx2="http://schemas.microsoft.com/office/drawing/2015/10/21/chartex" xmlns:cx3="http://schemas.microsoft.com/office/drawing/2016/5/9/chartex" xmlns:cx4="http://schemas.microsoft.com/office/drawing/2016/5/10/chartex" xmlns:cx5="http://schemas.microsoft.com/office/drawing/2016/5/11/chartex" xmlns:cx6="http://schemas.microsoft.com/office/drawing/2016/5/12/chartex" xmlns:cx7="http://schemas.microsoft.com/office/drawing/2016/5/13/chartex" xmlns:cx8="http://schemas.microsoft.com/office/drawing/2016/5/14/chartex" xmlns:mc="http://schemas.openxmlformats.org/markup-compatibility/2006" xmlns:aink="http://schemas.microsoft.com/office/drawing/2016/ink" xmlns:am3d="http://schemas.microsoft.com/office/drawing/2017/model3d" xmlns:o="urn:schemas-microsoft-com:office:office" xmlns:oel="http://schemas.microsoft.com/office/2019/extlst" xmlns:r="http://schemas.openxmlformats.org/officeDocument/2006/relationships" xmlns:m="http://schemas.openxmlformats.org/officeDocument/2006/math" xmlns:v="urn:schemas-microsoft-com:vml" xmlns:wp14="http://schemas.microsoft.com/office/word/2010/wordprocessingDrawing" xmlns:wp="http://schemas.openxmlformats.org/drawingml/2006/wordprocessingDrawing" xmlns:w10="urn:schemas-microsoft-com:office:word" xmlns:w="http://schemas.openxmlformats.org/wordprocessingml/2006/main" xmlns:w14="http://schemas.microsoft.com/office/word/2010/wordml" xmlns:w15="http://schemas.microsoft.com/office/word/2012/wordml" xmlns:w16cex="http://schemas.microsoft.com/office/word/2018/wordml/cex" xmlns:w16cid="http://schemas.microsoft.com/office/word/2016/wordml/cid" xmlns:w16="http://schemas.microsoft.com/office/word/2018/wordml" xmlns:w16du="http://schemas.microsoft.com/office/word/2023/wordml/word16du" xmlns:w16sdtdh="http://schemas.microsoft.com/office/word/2020/wordml/sdtdatahash" xmlns:w16sdtfl="http://schemas.microsoft.com/office/word/2024/wordml/sdtformatlock" xmlns:w16se="http://schemas.microsoft.com/office/word/2015/wordml/symex" xmlns:wpg="http://schemas.microsoft.com/office/word/2010/wordprocessingGroup" xmlns:wpi="http://schemas.microsoft.com/office/word/2010/wordprocessingInk" xmlns:wne="http://schemas.microsoft.com/office/word/2006/wordml" xmlns:wps="http://schemas.microsoft.com/office/word/2010/wordprocessingShape" mc:Ignorable="w14 w15 w16se w16cid w16 w16cex w16sdtdh w16sdtfl w16du wp14">
   <w:p>
     <w:pPr>
@@ -2335,7 +2262,7 @@
 </w:ftr>
 </file>
 
-<file path=word\footer3.xml><?xml version="1.0" encoding="utf-8"?>
+<file path=word/footer3.xml><?xml version="1.0" encoding="utf-8"?>
 <w:ftr xmlns:wpc="http://schemas.microsoft.com/office/word/2010/wordprocessingCanvas" xmlns:cx="http://schemas.microsoft.com/office/drawing/2014/chartex" xmlns:cx1="http://schemas.microsoft.com/office/drawing/2015/9/8/chartex" xmlns:cx2="http://schemas.microsoft.com/office/drawing/2015/10/21/chartex" xmlns:cx3="http://schemas.microsoft.com/office/drawing/2016/5/9/chartex" xmlns:cx4="http://schemas.microsoft.com/office/drawing/2016/5/10/chartex" xmlns:cx5="http://schemas.microsoft.com/office/drawing/2016/5/11/chartex" xmlns:cx6="http://schemas.microsoft.com/office/drawing/2016/5/12/chartex" xmlns:cx7="http://schemas.microsoft.com/office/drawing/2016/5/13/chartex" xmlns:cx8="http://schemas.microsoft.com/office/drawing/2016/5/14/chartex" xmlns:mc="http://schemas.openxmlformats.org/markup-compatibility/2006" xmlns:aink="http://schemas.microsoft.com/office/drawing/2016/ink" xmlns:am3d="http://schemas.microsoft.com/office/drawing/2017/model3d" xmlns:o="urn:schemas-microsoft-com:office:office" xmlns:oel="http://schemas.microsoft.com/office/2019/extlst" xmlns:r="http://schemas.openxmlformats.org/officeDocument/2006/relationships" xmlns:m="http://schemas.openxmlformats.org/officeDocument/2006/math" xmlns:v="urn:schemas-microsoft-com:vml" xmlns:wp14="http://schemas.microsoft.com/office/word/2010/wordprocessingDrawing" xmlns:wp="http://schemas.openxmlformats.org/drawingml/2006/wordprocessingDrawing" xmlns:w10="urn:schemas-microsoft-com:office:word" xmlns:w="http://schemas.openxmlformats.org/wordprocessingml/2006/main" xmlns:w14="http://schemas.microsoft.com/office/word/2010/wordml" xmlns:w15="http://schemas.microsoft.com/office/word/2012/wordml" xmlns:w16cex="http://schemas.microsoft.com/office/word/2018/wordml/cex" xmlns:w16cid="http://schemas.microsoft.com/office/word/2016/wordml/cid" xmlns:w16="http://schemas.microsoft.com/office/word/2018/wordml" xmlns:w16du="http://schemas.microsoft.com/office/word/2023/wordml/word16du" xmlns:w16sdtdh="http://schemas.microsoft.com/office/word/2020/wordml/sdtdatahash" xmlns:w16sdtfl="http://schemas.microsoft.com/office/word/2024/wordml/sdtformatlock" xmlns:w16se="http://schemas.microsoft.com/office/word/2015/wordml/symex" xmlns:wpg="http://schemas.microsoft.com/office/word/2010/wordprocessingGroup" xmlns:wpi="http://schemas.microsoft.com/office/word/2010/wordprocessingInk" xmlns:wne="http://schemas.microsoft.com/office/word/2006/wordml" xmlns:wps="http://schemas.microsoft.com/office/word/2010/wordprocessingShape" mc:Ignorable="w14 w15 w16se w16cid w16 w16cex w16sdtdh w16sdtfl w16du wp14">
   <w:p>
     <w:pPr>
@@ -2345,7 +2272,7 @@
 </w:ftr>
 </file>
 
-<file path=word\footer4.xml><?xml version="1.0" encoding="utf-8"?>
+<file path=word/footer4.xml><?xml version="1.0" encoding="utf-8"?>
 <w:ftr xmlns:wpc="http://schemas.microsoft.com/office/word/2010/wordprocessingCanvas" xmlns:cx="http://schemas.microsoft.com/office/drawing/2014/chartex" xmlns:cx1="http://schemas.microsoft.com/office/drawing/2015/9/8/chartex" xmlns:cx2="http://schemas.microsoft.com/office/drawing/2015/10/21/chartex" xmlns:cx3="http://schemas.microsoft.com/office/drawing/2016/5/9/chartex" xmlns:cx4="http://schemas.microsoft.com/office/drawing/2016/5/10/chartex" xmlns:cx5="http://schemas.microsoft.com/office/drawing/2016/5/11/chartex" xmlns:cx6="http://schemas.microsoft.com/office/drawing/2016/5/12/chartex" xmlns:cx7="http://schemas.microsoft.com/office/drawing/2016/5/13/chartex" xmlns:cx8="http://schemas.microsoft.com/office/drawing/2016/5/14/chartex" xmlns:mc="http://schemas.openxmlformats.org/markup-compatibility/2006" xmlns:aink="http://schemas.microsoft.com/office/drawing/2016/ink" xmlns:am3d="http://schemas.microsoft.com/office/drawing/2017/model3d" xmlns:o="urn:schemas-microsoft-com:office:office" xmlns:oel="http://schemas.microsoft.com/office/2019/extlst" xmlns:r="http://schemas.openxmlformats.org/officeDocument/2006/relationships" xmlns:m="http://schemas.openxmlformats.org/officeDocument/2006/math" xmlns:v="urn:schemas-microsoft-com:vml" xmlns:wp14="http://schemas.microsoft.com/office/word/2010/wordprocessingDrawing" xmlns:wp="http://schemas.openxmlformats.org/drawingml/2006/wordprocessingDrawing" xmlns:w10="urn:schemas-microsoft-com:office:word" xmlns:w="http://schemas.openxmlformats.org/wordprocessingml/2006/main" xmlns:w14="http://schemas.microsoft.com/office/word/2010/wordml" xmlns:w15="http://schemas.microsoft.com/office/word/2012/wordml" xmlns:w16cex="http://schemas.microsoft.com/office/word/2018/wordml/cex" xmlns:w16cid="http://schemas.microsoft.com/office/word/2016/wordml/cid" xmlns:w16="http://schemas.microsoft.com/office/word/2018/wordml" xmlns:w16du="http://schemas.microsoft.com/office/word/2023/wordml/word16du" xmlns:w16sdtdh="http://schemas.microsoft.com/office/word/2020/wordml/sdtdatahash" xmlns:w16sdtfl="http://schemas.microsoft.com/office/word/2024/wordml/sdtformatlock" xmlns:w16se="http://schemas.microsoft.com/office/word/2015/wordml/symex" xmlns:wpg="http://schemas.microsoft.com/office/word/2010/wordprocessingGroup" xmlns:wpi="http://schemas.microsoft.com/office/word/2010/wordprocessingInk" xmlns:wne="http://schemas.microsoft.com/office/word/2006/wordml" xmlns:wps="http://schemas.microsoft.com/office/word/2010/wordprocessingShape" mc:Ignorable="w14 w15 w16se w16cid w16 w16cex w16sdtdh w16sdtfl w16du wp14">
   <w:p>
     <w:pPr>
@@ -2420,7 +2347,7 @@
 </w:ftr>
 </file>
 
-<file path=word\footnotes.xml><?xml version="1.0" encoding="utf-8"?>
+<file path=word/footnotes.xml><?xml version="1.0" encoding="utf-8"?>
 <w:footnotes xmlns:wpc="http://schemas.microsoft.com/office/word/2010/wordprocessingCanvas" xmlns:cx="http://schemas.microsoft.com/office/drawing/2014/chartex" xmlns:cx1="http://schemas.microsoft.com/office/drawing/2015/9/8/chartex" xmlns:cx2="http://schemas.microsoft.com/office/drawing/2015/10/21/chartex" xmlns:cx3="http://schemas.microsoft.com/office/drawing/2016/5/9/chartex" xmlns:cx4="http://schemas.microsoft.com/office/drawing/2016/5/10/chartex" xmlns:cx5="http://schemas.microsoft.com/office/drawing/2016/5/11/chartex" xmlns:cx6="http://schemas.microsoft.com/office/drawing/2016/5/12/chartex" xmlns:cx7="http://schemas.microsoft.com/office/drawing/2016/5/13/chartex" xmlns:cx8="http://schemas.microsoft.com/office/drawing/2016/5/14/chartex" xmlns:mc="http://schemas.openxmlformats.org/markup-compatibility/2006" xmlns:aink="http://schemas.microsoft.com/office/drawing/2016/ink" xmlns:am3d="http://schemas.microsoft.com/office/drawing/2017/model3d" xmlns:o="urn:schemas-microsoft-com:office:office" xmlns:oel="http://schemas.microsoft.com/office/2019/extlst" xmlns:r="http://schemas.openxmlformats.org/officeDocument/2006/relationships" xmlns:m="http://schemas.openxmlformats.org/officeDocument/2006/math" xmlns:v="urn:schemas-microsoft-com:vml" xmlns:wp14="http://schemas.microsoft.com/office/word/2010/wordprocessingDrawing" xmlns:wp="http://schemas.openxmlformats.org/drawingml/2006/wordprocessingDrawing" xmlns:w10="urn:schemas-microsoft-com:office:word" xmlns:w="http://schemas.openxmlformats.org/wordprocessingml/2006/main" xmlns:w14="http://schemas.microsoft.com/office/word/2010/wordml" xmlns:w15="http://schemas.microsoft.com/office/word/2012/wordml" xmlns:w16cex="http://schemas.microsoft.com/office/word/2018/wordml/cex" xmlns:w16cid="http://schemas.microsoft.com/office/word/2016/wordml/cid" xmlns:w16="http://schemas.microsoft.com/office/word/2018/wordml" xmlns:w16du="http://schemas.microsoft.com/office/word/2023/wordml/word16du" xmlns:w16sdtdh="http://schemas.microsoft.com/office/word/2020/wordml/sdtdatahash" xmlns:w16sdtfl="http://schemas.microsoft.com/office/word/2024/wordml/sdtformatlock" xmlns:w16se="http://schemas.microsoft.com/office/word/2015/wordml/symex" xmlns:wpg="http://schemas.microsoft.com/office/word/2010/wordprocessingGroup" xmlns:wpi="http://schemas.microsoft.com/office/word/2010/wordprocessingInk" xmlns:wne="http://schemas.microsoft.com/office/word/2006/wordml" xmlns:wps="http://schemas.microsoft.com/office/word/2010/wordprocessingShape" mc:Ignorable="w14 w15 w16se w16cid w16 w16cex w16sdtdh w16sdtfl w16du wp14">
   <w:footnote w:type="separator" w:id="-1">
     <w:p>
@@ -2439,7 +2366,7 @@
 </w:footnotes>
 </file>
 
-<file path=word\header1.xml><?xml version="1.0" encoding="utf-8"?>
+<file path=word/header1.xml><?xml version="1.0" encoding="utf-8"?>
 <w:hdr xmlns:wpc="http://schemas.microsoft.com/office/word/2010/wordprocessingCanvas" xmlns:cx="http://schemas.microsoft.com/office/drawing/2014/chartex" xmlns:cx1="http://schemas.microsoft.com/office/drawing/2015/9/8/chartex" xmlns:cx2="http://schemas.microsoft.com/office/drawing/2015/10/21/chartex" xmlns:cx3="http://schemas.microsoft.com/office/drawing/2016/5/9/chartex" xmlns:cx4="http://schemas.microsoft.com/office/drawing/2016/5/10/chartex" xmlns:cx5="http://schemas.microsoft.com/office/drawing/2016/5/11/chartex" xmlns:cx6="http://schemas.microsoft.com/office/drawing/2016/5/12/chartex" xmlns:cx7="http://schemas.microsoft.com/office/drawing/2016/5/13/chartex" xmlns:cx8="http://schemas.microsoft.com/office/drawing/2016/5/14/chartex" xmlns:mc="http://schemas.openxmlformats.org/markup-compatibility/2006" xmlns:aink="http://schemas.microsoft.com/office/drawing/2016/ink" xmlns:am3d="http://schemas.microsoft.com/office/drawing/2017/model3d" xmlns:o="urn:schemas-microsoft-com:office:office" xmlns:oel="http://schemas.microsoft.com/office/2019/extlst" xmlns:r="http://schemas.openxmlformats.org/officeDocument/2006/relationships" xmlns:m="http://schemas.openxmlformats.org/officeDocument/2006/math" xmlns:v="urn:schemas-microsoft-com:vml" xmlns:wp14="http://schemas.microsoft.com/office/word/2010/wordprocessingDrawing" xmlns:wp="http://schemas.openxmlformats.org/drawingml/2006/wordprocessingDrawing" xmlns:w10="urn:schemas-microsoft-com:office:word" xmlns:w="http://schemas.openxmlformats.org/wordprocessingml/2006/main" xmlns:w14="http://schemas.microsoft.com/office/word/2010/wordml" xmlns:w15="http://schemas.microsoft.com/office/word/2012/wordml" xmlns:w16cex="http://schemas.microsoft.com/office/word/2018/wordml/cex" xmlns:w16cid="http://schemas.microsoft.com/office/word/2016/wordml/cid" xmlns:w16="http://schemas.microsoft.com/office/word/2018/wordml" xmlns:w16du="http://schemas.microsoft.com/office/word/2023/wordml/word16du" xmlns:w16sdtdh="http://schemas.microsoft.com/office/word/2020/wordml/sdtdatahash" xmlns:w16sdtfl="http://schemas.microsoft.com/office/word/2024/wordml/sdtformatlock" xmlns:w16se="http://schemas.microsoft.com/office/word/2015/wordml/symex" xmlns:wpg="http://schemas.microsoft.com/office/word/2010/wordprocessingGroup" xmlns:wpi="http://schemas.microsoft.com/office/word/2010/wordprocessingInk" xmlns:wne="http://schemas.microsoft.com/office/word/2006/wordml" xmlns:wps="http://schemas.microsoft.com/office/word/2010/wordprocessingShape" mc:Ignorable="w14 w15 w16se w16cid w16 w16cex w16sdtdh w16sdtfl w16du wp14">
   <w:p>
     <w:pPr>
@@ -2449,7 +2376,7 @@
 </w:hdr>
 </file>
 
-<file path=word\header2.xml><?xml version="1.0" encoding="utf-8"?>
+<file path=word/header2.xml><?xml version="1.0" encoding="utf-8"?>
 <w:hdr xmlns:wpc="http://schemas.microsoft.com/office/word/2010/wordprocessingCanvas" xmlns:cx="http://schemas.microsoft.com/office/drawing/2014/chartex" xmlns:cx1="http://schemas.microsoft.com/office/drawing/2015/9/8/chartex" xmlns:cx2="http://schemas.microsoft.com/office/drawing/2015/10/21/chartex" xmlns:cx3="http://schemas.microsoft.com/office/drawing/2016/5/9/chartex" xmlns:cx4="http://schemas.microsoft.com/office/drawing/2016/5/10/chartex" xmlns:cx5="http://schemas.microsoft.com/office/drawing/2016/5/11/chartex" xmlns:cx6="http://schemas.microsoft.com/office/drawing/2016/5/12/chartex" xmlns:cx7="http://schemas.microsoft.com/office/drawing/2016/5/13/chartex" xmlns:cx8="http://schemas.microsoft.com/office/drawing/2016/5/14/chartex" xmlns:mc="http://schemas.openxmlformats.org/markup-compatibility/2006" xmlns:aink="http://schemas.microsoft.com/office/drawing/2016/ink" xmlns:am3d="http://schemas.microsoft.com/office/drawing/2017/model3d" xmlns:o="urn:schemas-microsoft-com:office:office" xmlns:oel="http://schemas.microsoft.com/office/2019/extlst" xmlns:r="http://schemas.openxmlformats.org/officeDocument/2006/relationships" xmlns:m="http://schemas.openxmlformats.org/officeDocument/2006/math" xmlns:v="urn:schemas-microsoft-com:vml" xmlns:wp14="http://schemas.microsoft.com/office/word/2010/wordprocessingDrawing" xmlns:wp="http://schemas.openxmlformats.org/drawingml/2006/wordprocessingDrawing" xmlns:w10="urn:schemas-microsoft-com:office:word" xmlns:w="http://schemas.openxmlformats.org/wordprocessingml/2006/main" xmlns:w14="http://schemas.microsoft.com/office/word/2010/wordml" xmlns:w15="http://schemas.microsoft.com/office/word/2012/wordml" xmlns:w16cex="http://schemas.microsoft.com/office/word/2018/wordml/cex" xmlns:w16cid="http://schemas.microsoft.com/office/word/2016/wordml/cid" xmlns:w16="http://schemas.microsoft.com/office/word/2018/wordml" xmlns:w16du="http://schemas.microsoft.com/office/word/2023/wordml/word16du" xmlns:w16sdtdh="http://schemas.microsoft.com/office/word/2020/wordml/sdtdatahash" xmlns:w16sdtfl="http://schemas.microsoft.com/office/word/2024/wordml/sdtformatlock" xmlns:w16se="http://schemas.microsoft.com/office/word/2015/wordml/symex" xmlns:wpg="http://schemas.microsoft.com/office/word/2010/wordprocessingGroup" xmlns:wpi="http://schemas.microsoft.com/office/word/2010/wordprocessingInk" xmlns:wne="http://schemas.microsoft.com/office/word/2006/wordml" xmlns:wps="http://schemas.microsoft.com/office/word/2010/wordprocessingShape" mc:Ignorable="w14 w15 w16se w16cid w16 w16cex w16sdtdh w16sdtfl w16du wp14">
   <w:p>
     <w:pPr>
@@ -2521,7 +2448,7 @@
 </w:hdr>
 </file>
 
-<file path=word\header3.xml><?xml version="1.0" encoding="utf-8"?>
+<file path=word/header3.xml><?xml version="1.0" encoding="utf-8"?>
 <w:hdr xmlns:wpc="http://schemas.microsoft.com/office/word/2010/wordprocessingCanvas" xmlns:cx="http://schemas.microsoft.com/office/drawing/2014/chartex" xmlns:cx1="http://schemas.microsoft.com/office/drawing/2015/9/8/chartex" xmlns:cx2="http://schemas.microsoft.com/office/drawing/2015/10/21/chartex" xmlns:cx3="http://schemas.microsoft.com/office/drawing/2016/5/9/chartex" xmlns:cx4="http://schemas.microsoft.com/office/drawing/2016/5/10/chartex" xmlns:cx5="http://schemas.microsoft.com/office/drawing/2016/5/11/chartex" xmlns:cx6="http://schemas.microsoft.com/office/drawing/2016/5/12/chartex" xmlns:cx7="http://schemas.microsoft.com/office/drawing/2016/5/13/chartex" xmlns:cx8="http://schemas.microsoft.com/office/drawing/2016/5/14/chartex" xmlns:mc="http://schemas.openxmlformats.org/markup-compatibility/2006" xmlns:aink="http://schemas.microsoft.com/office/drawing/2016/ink" xmlns:am3d="http://schemas.microsoft.com/office/drawing/2017/model3d" xmlns:o="urn:schemas-microsoft-com:office:office" xmlns:oel="http://schemas.microsoft.com/office/2019/extlst" xmlns:r="http://schemas.openxmlformats.org/officeDocument/2006/relationships" xmlns:m="http://schemas.openxmlformats.org/officeDocument/2006/math" xmlns:v="urn:schemas-microsoft-com:vml" xmlns:wp14="http://schemas.microsoft.com/office/word/2010/wordprocessingDrawing" xmlns:wp="http://schemas.openxmlformats.org/drawingml/2006/wordprocessingDrawing" xmlns:w10="urn:schemas-microsoft-com:office:word" xmlns:w="http://schemas.openxmlformats.org/wordprocessingml/2006/main" xmlns:w14="http://schemas.microsoft.com/office/word/2010/wordml" xmlns:w15="http://schemas.microsoft.com/office/word/2012/wordml" xmlns:w16cex="http://schemas.microsoft.com/office/word/2018/wordml/cex" xmlns:w16cid="http://schemas.microsoft.com/office/word/2016/wordml/cid" xmlns:w16="http://schemas.microsoft.com/office/word/2018/wordml" xmlns:w16du="http://schemas.microsoft.com/office/word/2023/wordml/word16du" xmlns:w16sdtdh="http://schemas.microsoft.com/office/word/2020/wordml/sdtdatahash" xmlns:w16sdtfl="http://schemas.microsoft.com/office/word/2024/wordml/sdtformatlock" xmlns:w16se="http://schemas.microsoft.com/office/word/2015/wordml/symex" xmlns:wpg="http://schemas.microsoft.com/office/word/2010/wordprocessingGroup" xmlns:wpi="http://schemas.microsoft.com/office/word/2010/wordprocessingInk" xmlns:wne="http://schemas.microsoft.com/office/word/2006/wordml" xmlns:wps="http://schemas.microsoft.com/office/word/2010/wordprocessingShape" mc:Ignorable="w14 w15 w16se w16cid w16 w16cex w16sdtdh w16sdtfl w16du wp14">
   <w:p>
     <w:pPr>
@@ -2531,7 +2458,7 @@
 </w:hdr>
 </file>
 
-<file path=word\header4.xml><?xml version="1.0" encoding="utf-8"?>
+<file path=word/header4.xml><?xml version="1.0" encoding="utf-8"?>
 <w:hdr xmlns:wpc="http://schemas.microsoft.com/office/word/2010/wordprocessingCanvas" xmlns:cx="http://schemas.microsoft.com/office/drawing/2014/chartex" xmlns:cx1="http://schemas.microsoft.com/office/drawing/2015/9/8/chartex" xmlns:cx2="http://schemas.microsoft.com/office/drawing/2015/10/21/chartex" xmlns:cx3="http://schemas.microsoft.com/office/drawing/2016/5/9/chartex" xmlns:cx4="http://schemas.microsoft.com/office/drawing/2016/5/10/chartex" xmlns:cx5="http://schemas.microsoft.com/office/drawing/2016/5/11/chartex" xmlns:cx6="http://schemas.microsoft.com/office/drawing/2016/5/12/chartex" xmlns:cx7="http://schemas.microsoft.com/office/drawing/2016/5/13/chartex" xmlns:cx8="http://schemas.microsoft.com/office/drawing/2016/5/14/chartex" xmlns:mc="http://schemas.openxmlformats.org/markup-compatibility/2006" xmlns:aink="http://schemas.microsoft.com/office/drawing/2016/ink" xmlns:am3d="http://schemas.microsoft.com/office/drawing/2017/model3d" xmlns:o="urn:schemas-microsoft-com:office:office" xmlns:oel="http://schemas.microsoft.com/office/2019/extlst" xmlns:r="http://schemas.openxmlformats.org/officeDocument/2006/relationships" xmlns:m="http://schemas.openxmlformats.org/officeDocument/2006/math" xmlns:v="urn:schemas-microsoft-com:vml" xmlns:wp14="http://schemas.microsoft.com/office/word/2010/wordprocessingDrawing" xmlns:wp="http://schemas.openxmlformats.org/drawingml/2006/wordprocessingDrawing" xmlns:w10="urn:schemas-microsoft-com:office:word" xmlns:w="http://schemas.openxmlformats.org/wordprocessingml/2006/main" xmlns:w14="http://schemas.microsoft.com/office/word/2010/wordml" xmlns:w15="http://schemas.microsoft.com/office/word/2012/wordml" xmlns:w16cex="http://schemas.microsoft.com/office/word/2018/wordml/cex" xmlns:w16cid="http://schemas.microsoft.com/office/word/2016/wordml/cid" xmlns:w16="http://schemas.microsoft.com/office/word/2018/wordml" xmlns:w16du="http://schemas.microsoft.com/office/word/2023/wordml/word16du" xmlns:w16sdtdh="http://schemas.microsoft.com/office/word/2020/wordml/sdtdatahash" xmlns:w16sdtfl="http://schemas.microsoft.com/office/word/2024/wordml/sdtformatlock" xmlns:w16se="http://schemas.microsoft.com/office/word/2015/wordml/symex" xmlns:wpg="http://schemas.microsoft.com/office/word/2010/wordprocessingGroup" xmlns:wpi="http://schemas.microsoft.com/office/word/2010/wordprocessingInk" xmlns:wne="http://schemas.microsoft.com/office/word/2006/wordml" xmlns:wps="http://schemas.microsoft.com/office/word/2010/wordprocessingShape" mc:Ignorable="w14 w15 w16se w16cid w16 w16cex w16sdtdh w16sdtfl w16du wp14">
   <w:p>
     <w:pPr>
@@ -2606,120 +2533,7 @@
 </w:hdr>
 </file>
 
-<file path=word\settings.xml><?xml version="1.0" encoding="utf-8"?>
-<w:settings xmlns:mc="http://schemas.openxmlformats.org/markup-compatibility/2006" xmlns:o="urn:schemas-microsoft-com:office:office" xmlns:r="http://schemas.openxmlformats.org/officeDocument/2006/relationships" xmlns:m="http://schemas.openxmlformats.org/officeDocument/2006/math" xmlns:v="urn:schemas-microsoft-com:vml" xmlns:w10="urn:schemas-microsoft-com:office:word" xmlns:w="http://schemas.openxmlformats.org/wordprocessingml/2006/main" xmlns:w14="http://schemas.microsoft.com/office/word/2010/wordml" xmlns:w15="http://schemas.microsoft.com/office/word/2012/wordml" xmlns:w16cex="http://schemas.microsoft.com/office/word/2018/wordml/cex" xmlns:w16cid="http://schemas.microsoft.com/office/word/2016/wordml/cid" xmlns:w16="http://schemas.microsoft.com/office/word/2018/wordml" xmlns:w16du="http://schemas.microsoft.com/office/word/2023/wordml/word16du" xmlns:w16sdtdh="http://schemas.microsoft.com/office/word/2020/wordml/sdtdatahash" xmlns:w16sdtfl="http://schemas.microsoft.com/office/word/2024/wordml/sdtformatlock" xmlns:w16se="http://schemas.microsoft.com/office/word/2015/wordml/symex" xmlns:sl="http://schemas.openxmlformats.org/schemaLibrary/2006/main" mc:Ignorable="w14 w15 w16se w16cid w16 w16cex w16sdtdh w16sdtfl w16du">
-  <w:zoom w:percent="100"/>
-  <w:proofState w:spelling="clean" w:grammar="clean"/>
-  <w:defaultTabStop w:val="720"/>
-  <w:hyphenationZone w:val="425"/>
-  <w:drawingGridHorizontalSpacing w:val="110"/>
-  <w:displayHorizontalDrawingGridEvery w:val="2"/>
-  <w:characterSpacingControl w:val="doNotCompress"/>
-  <w:hdrShapeDefaults>
-    <o:shapedefaults v:ext="edit" spidmax="2050"/>
-  </w:hdrShapeDefaults>
-  <w:footnotePr>
-    <w:footnote w:id="-1"/>
-    <w:footnote w:id="0"/>
-  </w:footnotePr>
-  <w:endnotePr>
-    <w:endnote w:id="-1"/>
-    <w:endnote w:id="0"/>
-  </w:endnotePr>
-  <w:compat>
-    <w:ulTrailSpace/>
-    <w:compatSetting w:name="compatibilityMode" w:uri="http://schemas.microsoft.com/office/word" w:val="15"/>
-    <w:compatSetting w:name="overrideTableStyleFontSizeAndJustification" w:uri="http://schemas.microsoft.com/office/word" w:val="1"/>
-    <w:compatSetting w:name="enableOpenTypeFeatures" w:uri="http://schemas.microsoft.com/office/word" w:val="1"/>
-    <w:compatSetting w:name="doNotFlipMirrorIndents" w:uri="http://schemas.microsoft.com/office/word" w:val="1"/>
-    <w:compatSetting w:name="differentiateMultirowTableHeaders" w:uri="http://schemas.microsoft.com/office/word" w:val="1"/>
-    <w:compatSetting w:name="useWord2013TrackBottomHyphenation" w:uri="http://schemas.microsoft.com/office/word" w:val="1"/>
-  </w:compat>
-  <w:rsids>
-    <w:rsidRoot w:val="002B46B2"/>
-    <w:rsid w:val="000604C6"/>
-    <w:rsid w:val="000924E4"/>
-    <w:rsid w:val="000B53D3"/>
-    <w:rsid w:val="000D1BA8"/>
-    <w:rsid w:val="00103B49"/>
-    <w:rsid w:val="00170817"/>
-    <w:rsid w:val="00192463"/>
-    <w:rsid w:val="001C117B"/>
-    <w:rsid w:val="001D6E90"/>
-    <w:rsid w:val="002576F7"/>
-    <w:rsid w:val="002878F1"/>
-    <w:rsid w:val="002B46B2"/>
-    <w:rsid w:val="002E3A8F"/>
-    <w:rsid w:val="002E6548"/>
-    <w:rsid w:val="0031589A"/>
-    <w:rsid w:val="003800F5"/>
-    <w:rsid w:val="003C0327"/>
-    <w:rsid w:val="003E5E0E"/>
-    <w:rsid w:val="003F5654"/>
-    <w:rsid w:val="0050304F"/>
-    <w:rsid w:val="005268FE"/>
-    <w:rsid w:val="005370D9"/>
-    <w:rsid w:val="005C7771"/>
-    <w:rsid w:val="005E071D"/>
-    <w:rsid w:val="006C0930"/>
-    <w:rsid w:val="00786455"/>
-    <w:rsid w:val="00806999"/>
-    <w:rsid w:val="0084083B"/>
-    <w:rsid w:val="0084532A"/>
-    <w:rsid w:val="008E1662"/>
-    <w:rsid w:val="008E53B7"/>
-    <w:rsid w:val="00970757"/>
-    <w:rsid w:val="00A272CF"/>
-    <w:rsid w:val="00AB2A51"/>
-    <w:rsid w:val="00AD0A50"/>
-    <w:rsid w:val="00AD0FB6"/>
-    <w:rsid w:val="00B27419"/>
-    <w:rsid w:val="00B3532F"/>
-    <w:rsid w:val="00BB4875"/>
-    <w:rsid w:val="00BC6FD7"/>
-    <w:rsid w:val="00C12292"/>
-    <w:rsid w:val="00D032A9"/>
-    <w:rsid w:val="00D2193E"/>
-    <w:rsid w:val="00D429D4"/>
-    <w:rsid w:val="00DA2854"/>
-    <w:rsid w:val="00DE3041"/>
-    <w:rsid w:val="00DF0B42"/>
-    <w:rsid w:val="00E2469F"/>
-    <w:rsid w:val="00E37894"/>
-    <w:rsid w:val="00E665B1"/>
-    <w:rsid w:val="00ED3A4F"/>
-    <w:rsid w:val="00FD251C"/>
-    <w:rsid w:val="00FD299A"/>
-  </w:rsids>
-  <m:mathPr>
-    <m:mathFont m:val="Cambria Math"/>
-    <m:brkBin m:val="before"/>
-    <m:brkBinSub m:val="--"/>
-    <m:smallFrac m:val="0"/>
-    <m:dispDef/>
-    <m:lMargin m:val="0"/>
-    <m:rMargin m:val="0"/>
-    <m:defJc m:val="centerGroup"/>
-    <m:wrapIndent m:val="1440"/>
-    <m:intLim m:val="subSup"/>
-    <m:naryLim m:val="undOvr"/>
-  </m:mathPr>
-  <w:themeFontLang w:val="pt-BR"/>
-  <w:clrSchemeMapping w:bg1="light1" w:t1="dark1" w:bg2="light2" w:t2="dark2" w:accent1="accent1" w:accent2="accent2" w:accent3="accent3" w:accent4="accent4" w:accent5="accent5" w:accent6="accent6" w:hyperlink="hyperlink" w:followedHyperlink="followedHyperlink"/>
-  <w:shapeDefaults>
-    <o:shapedefaults v:ext="edit" spidmax="2050"/>
-    <o:shapelayout v:ext="edit">
-      <o:idmap v:ext="edit" data="2"/>
-    </o:shapelayout>
-  </w:shapeDefaults>
-  <w:decimalSymbol w:val=","/>
-  <w:listSeparator w:val=";"/>
-  <w14:docId w14:val="735E263E"/>
-  <w15:docId w15:val="{EFD91534-411C-4109-8B00-E084ACD11E90}"/>
-</w:settings>
-</file>
-
-<file path=word\styles.xml><?xml version="1.0" encoding="utf-8"?>
+<file path=word/styles.xml><?xml version="1.0" encoding="utf-8"?>
 <w:styles xmlns:mc="http://schemas.openxmlformats.org/markup-compatibility/2006" xmlns:r="http://schemas.openxmlformats.org/officeDocument/2006/relationships" xmlns:w="http://schemas.openxmlformats.org/wordprocessingml/2006/main" xmlns:w14="http://schemas.microsoft.com/office/word/2010/wordml" xmlns:w15="http://schemas.microsoft.com/office/word/2012/wordml" xmlns:w16cex="http://schemas.microsoft.com/office/word/2018/wordml/cex" xmlns:w16cid="http://schemas.microsoft.com/office/word/2016/wordml/cid" xmlns:w16="http://schemas.microsoft.com/office/word/2018/wordml" xmlns:w16du="http://schemas.microsoft.com/office/word/2023/wordml/word16du" xmlns:w16sdtdh="http://schemas.microsoft.com/office/word/2020/wordml/sdtdatahash" xmlns:w16sdtfl="http://schemas.microsoft.com/office/word/2024/wordml/sdtformatlock" xmlns:w16se="http://schemas.microsoft.com/office/word/2015/wordml/symex" mc:Ignorable="w14 w15 w16se w16cid w16 w16cex w16sdtdh w16sdtfl w16du">
   <w:docDefaults>
     <w:rPrDefault>
@@ -3276,7 +3090,7 @@
 </w:styles>
 </file>
 
-<file path=word\theme\theme1.xml><?xml version="1.0" encoding="utf-8"?>
+<file path=word/theme/theme1.xml><?xml version="1.0" encoding="utf-8"?>
 <a:theme xmlns:a="http://schemas.openxmlformats.org/drawingml/2006/main" name="Office Theme">
   <a:themeElements>
     <a:clrScheme name="Office">
@@ -3557,8 +3371,4 @@
   <a:objectDefaults/>
   <a:extraClrSchemeLst/>
 </a:theme>
-</file>
-
-<file path=word\webSettings.xml><?xml version="1.0" encoding="utf-8"?>
-<w:webSettings xmlns:mc="http://schemas.openxmlformats.org/markup-compatibility/2006" xmlns:r="http://schemas.openxmlformats.org/officeDocument/2006/relationships" xmlns:w="http://schemas.openxmlformats.org/wordprocessingml/2006/main" xmlns:w14="http://schemas.microsoft.com/office/word/2010/wordml" xmlns:w15="http://schemas.microsoft.com/office/word/2012/wordml" xmlns:w16cex="http://schemas.microsoft.com/office/word/2018/wordml/cex" xmlns:w16cid="http://schemas.microsoft.com/office/word/2016/wordml/cid" xmlns:w16="http://schemas.microsoft.com/office/word/2018/wordml" xmlns:w16du="http://schemas.microsoft.com/office/word/2023/wordml/word16du" xmlns:w16sdtdh="http://schemas.microsoft.com/office/word/2020/wordml/sdtdatahash" xmlns:w16sdtfl="http://schemas.microsoft.com/office/word/2024/wordml/sdtformatlock" xmlns:w16se="http://schemas.microsoft.com/office/word/2015/wordml/symex" mc:Ignorable="w14 w15 w16se w16cid w16 w16cex w16sdtdh w16sdtfl w16du"/>
 </file>
</xml_diff>